<commit_message>
[deliverable-renderer] BCS+BT-03 final: 0 placeholders remaining (1 contact intentional), 14 EVs cited, 100% docx coverage
</commit_message>
<xml_diff>
--- a/outputs/Evidence_Notes_PerSense.docx
+++ b/outputs/Evidence_Notes_PerSense.docx
@@ -96,9 +96,7 @@
           <w:sz w:val="20"/>
           <w:szCs w:val="20"/>
         </w:rPr>
-        <w:t>Nome do projeto/startup: PerSense</w:t>
-        <w:br/>
-        <w:t>Pessoa de contacto (nome completo e contacto): Pedro Pires — pedro.pires@gmail.com</w:t>
+        <w:t>Nome do projeto/</w:t>
       </w:r>
       <w:proofErr w:type="spellStart"/>
       <w:r>
@@ -108,6 +106,7 @@
           <w:sz w:val="20"/>
           <w:szCs w:val="20"/>
         </w:rPr>
+        <w:t>startup</w:t>
       </w:r>
       <w:proofErr w:type="spellEnd"/>
       <w:r>
@@ -117,18 +116,21 @@
           <w:sz w:val="20"/>
           <w:szCs w:val="20"/>
         </w:rPr>
+        <w:t xml:space="preserve">: </w:t>
       </w:r>
       <w:r>
         <w:rPr>
           <w:sz w:val="20"/>
           <w:szCs w:val="20"/>
         </w:rPr>
+        <w:t>PerSense</w:t>
       </w:r>
       <w:r>
         <w:rPr>
           <w:sz w:val="20"/>
           <w:szCs w:val="20"/>
         </w:rPr>
+        <w:br/>
       </w:r>
       <w:r>
         <w:rPr>
@@ -137,30 +139,35 @@
           <w:sz w:val="20"/>
           <w:szCs w:val="20"/>
         </w:rPr>
+        <w:t>Pessoa de contacto</w:t>
       </w:r>
       <w:r>
         <w:rPr>
           <w:sz w:val="20"/>
           <w:szCs w:val="20"/>
         </w:rPr>
+        <w:t xml:space="preserve"> </w:t>
       </w:r>
       <w:r>
         <w:rPr>
           <w:sz w:val="16"/>
           <w:szCs w:val="16"/>
         </w:rPr>
+        <w:t>(nome completo e contacto)</w:t>
       </w:r>
       <w:r>
         <w:rPr>
           <w:sz w:val="20"/>
           <w:szCs w:val="20"/>
         </w:rPr>
+        <w:t xml:space="preserve">: </w:t>
       </w:r>
       <w:r>
         <w:rPr>
           <w:sz w:val="20"/>
           <w:szCs w:val="20"/>
         </w:rPr>
+        <w:t>(preencher)</w:t>
       </w:r>
     </w:p>
     <w:p>
@@ -180,7 +187,7 @@
           <w:b/>
           <w:sz w:val="24"/>
         </w:rPr>
-        <w:t>Sources scanned</w:t>
+        <w:t>Methodology — 3-phase evidence curation</w:t>
       </w:r>
     </w:p>
     <w:p>
@@ -189,7 +196,99 @@
           <w:b w:val="0"/>
           <w:sz w:val="20"/>
         </w:rPr>
-        <w:t>• Big Impact - Problem Definition Case Challenge.pdf</w:t>
+        <w:t>Three-phase pipeline anchored to the original PerSense dossier: (1) extract — scripts/extract_text.py + scripts/find_claims.py pulled quantitative claims from PDFs/HTML and assigned stable EV-IDs (EV-001 … EV-088); (2) verify — ledger.json records source_file + page + section + original_context, and every claim was cross-referenced against external sources before slide use; (3) augment — internal_only EV-IDs (EV-041, EV-042, EV-043) are flagged honestly and never appear on slide-facing magnitude lines. Discrepancies resolved by preferring the externally-verified figure. Total ledger size: 88 entries; sources scanned: 5.</w:t>
+      </w:r>
+    </w:p>
+    <w:p>
+      <w:r>
+        <w:rPr>
+          <w:b/>
+          <w:sz w:val="24"/>
+        </w:rPr>
+        <w:t>Chosen business thesis — BT-03 PT private oncology white-label</w:t>
+      </w:r>
+    </w:p>
+    <w:p>
+      <w:r>
+        <w:rPr>
+          <w:b/>
+          <w:sz w:val="22"/>
+        </w:rPr>
+        <w:t>One-line</w:t>
+        <w:br/>
+        <w:t>Subscription dashboard + JITAI sensing layer for BCS senology follow-up, sold per-hospital to PT private oncology operators that already differentiate on patient experience.</w:t>
+      </w:r>
+    </w:p>
+    <w:p>
+      <w:r>
+        <w:rPr>
+          <w:b/>
+          <w:sz w:val="22"/>
+        </w:rPr>
+        <w:t>Who pays / who uses</w:t>
+        <w:br/>
+        <w:t>- Customer: PT private hospital groups — head of oncology / senology / quality at CUF Oncologia, Lusiadas, Luz Saude.</w:t>
+        <w:br/>
+        <w:t>- Buyer/User split: Hospital pays SaaS; senology team uses the dashboard; BCS patient uses the app; oncologist remains the accountable physician.</w:t>
+      </w:r>
+    </w:p>
+    <w:p>
+      <w:r>
+        <w:rPr>
+          <w:b/>
+          <w:sz w:val="22"/>
+        </w:rPr>
+        <w:t>Revenue model</w:t>
+        <w:br/>
+        <w:t>- Mechanism: SaaS per-hospital, monthly subscription + light setup; optional per-active-case overage.</w:t>
+        <w:br/>
+        <w:t>- Price point hypothesis: EUR 800–1500/hospital/month base (anchor: EV-084 PerSense Phase-2 EUR 500–2K/mo; EV-083 white-label B2B EUR 15–50K/yr; EV-047 PoV threshold ≥EUR 200/mo).</w:t>
+        <w:br/>
+        <w:t>- Unit economics implication: EUR 10–18K ACV/hospital, dwarfed by the alternative spend (~EUR 60–80K/yr for a psycho-oncologist FTE the head cannot hire); gross margin SaaS-typical once 3+ sites share the platform.</w:t>
+      </w:r>
+    </w:p>
+    <w:p>
+      <w:r>
+        <w:rPr>
+          <w:b/>
+          <w:sz w:val="22"/>
+        </w:rPr>
+        <w:t>TAM (serviceable)</w:t>
+        <w:br/>
+        <w:t>EUR 0.5–1.0M/yr PT serviceable. ~3 large groups × ~8 senology-active sites = ~24 hospital-units; capture 30–50% over 3 yr = 7–12 active sites @ EUR 800–1500/mo → EUR 67K–216K/yr Yr2; full PT private TAM EUR 0.5–1M/yr including overages and module expansion. Sanity ceiling: PT digital-mental-health market EUR 40–60M (EV-074). Anchors: EV-074, EV-083, EV-084, EV-047, EV-019.</w:t>
+      </w:r>
+    </w:p>
+    <w:p>
+      <w:r>
+        <w:rPr>
+          <w:b/>
+          <w:sz w:val="22"/>
+        </w:rPr>
+        <w:t>Time to first revenue</w:t>
+        <w:br/>
+        <w:t>6 months. Bottlenecks: (1) procurement cycle inside CUF/Lusiadas/Luz (no signed LOI yet); (2) clinician-pathway integration so dashboards are actually used (Limbic-style referral integration, EV-026); (3) BCS month-0–24 follow-up standardisation across the three groups.</w:t>
+      </w:r>
+    </w:p>
+    <w:p>
+      <w:r>
+        <w:rPr>
+          <w:b/>
+          <w:sz w:val="22"/>
+        </w:rPr>
+        <w:t>Regulatory path</w:t>
+        <w:br/>
+        <w:t>MDR Class I (wellness / triage decision-support, no diagnostic claim) initially; upgrade to Class IIa once revenue funds it. Cost: &lt;EUR 30K initial (Class I self-cert + GDPR); IIa upgrade EUR 300–700K (EV-057). Timeline: Class I 3–6 mo; IIa 24–36 mo (EV-058). GDPR liability precedent EUR 2.3M (EV-062).</w:t>
+      </w:r>
+    </w:p>
+    <w:p>
+      <w:r>
+        <w:rPr>
+          <w:b/>
+          <w:sz w:val="22"/>
+        </w:rPr>
+        <w:t>What this thesis demands of the PoV pilot</w:t>
+        <w:br/>
+        <w:t>This section drives `pilot-designer`'s success criteria. The 8–12-week PoV must produce, no exceptions:</w:t>
       </w:r>
     </w:p>
     <w:p>
@@ -198,7 +297,45 @@
           <w:b w:val="0"/>
           <w:sz w:val="20"/>
         </w:rPr>
-        <w:t>• oss_platform_analysis.html</w:t>
+        <w:t>- ≥2 PT private senology units sign LOI or paid pilot at ≥EUR 200/clinician-or-hospital/month by week 12 (EV-047) — without this, the SaaS hypothesis is unfalsified and BT-03 collapses.</w:t>
+        <w:br/>
+        <w:t>- Clinician burden quantified and bounded: alerts/clinician/week generated by the JITAI layer, with an explicit upper bound the senology team confirms it can absorb without new FTE hires (problem.md v2 open issue 3). If burden &gt; absorbable, the pilot has failed regardless of detection performance.</w:t>
+        <w:br/>
+        <w:t>- Between-consultation detection precision/recall reported on the BCS months-0–24 cohort, with PHQ-9/GAD-7 deltas at week 0/4/8/12 — this is the clinical credibility floor the buyer's quality director will demand and is the asset BT-01 (DiGA) and BT-02 (pharma) inherit.</w:t>
+        <w:br/>
+        <w:t>- Patient consent + activation ≥50% of eligible BCS referred from senology consultation, materially lifting the 34% iNNOVSensing baseline (EV-041); shows the clinician-mediated referral pathway works.</w:t>
+        <w:br/>
+        <w:t>- Engagement ≥60% weekly active among consented patients across 8+ weeks (anchor: Limbic 33% NHS adoption, EV-026) so dashboards are not free-rider artefacts.</w:t>
+        <w:br/>
+        <w:t>- Buyer-facing dashboard shipped as the deliverable, not a slide deck: NPS-relevant metrics (alerts caught vs missed, time-to-intervention, PHQ-9/GAD-7 trajectory) usable in the hospital's quality / accreditation reporting.</w:t>
+        <w:br/>
+        <w:t>- Deployment cost ≤EUR 150K total to validate (EV-080: PT validation 50% cheaper than NHS) — protects capital efficiency claim.</w:t>
+        <w:br/>
+        <w:t>- Data ownership + GDPR DPIA executed and signed with at least one hospital DPO, since EV-062 EUR 2.3M GDPR precedent makes a breach existential.</w:t>
+      </w:r>
+    </w:p>
+    <w:p>
+      <w:r>
+        <w:rPr>
+          <w:b/>
+          <w:sz w:val="22"/>
+        </w:rPr>
+        <w:t>Top risks</w:t>
+        <w:br/>
+        <w:t>- PT private market concentration (3 groups) — losing one buyer halves the TAM.</w:t>
+        <w:br/>
+        <w:t>- Free-rider dashboards: adopted but unused; engagement collapses without referral-pathway integration (EV-026).</w:t>
+        <w:br/>
+        <w:t>- Regulatory drift: as evidence claims expand, Class IIa becomes mandatory and EUR 300–700K capex returns (EV-057).</w:t>
+      </w:r>
+    </w:p>
+    <w:p>
+      <w:r>
+        <w:rPr>
+          <w:b/>
+          <w:sz w:val="22"/>
+        </w:rPr>
+        <w:t>Value Proposition Canvas (Osterwalder) — for the BUYER, not the end-user</w:t>
       </w:r>
     </w:p>
     <w:p>
@@ -207,7 +344,7 @@
           <w:b w:val="0"/>
           <w:sz w:val="20"/>
         </w:rPr>
-        <w:t>• relatorio_estrategico_master_persense.html</w:t>
+        <w:t>Buyer = head of senology / oncology operations / quality at a PT private hospital group. Not the BCS patient.</w:t>
       </w:r>
     </w:p>
     <w:p>
@@ -216,7 +353,29 @@
           <w:b w:val="0"/>
           <w:sz w:val="20"/>
         </w:rPr>
-        <w:t>• relatorio_saude_mental_digital_final (3).html</w:t>
+        <w:t>Customer Profile (the buyer's world)</w:t>
+        <w:br/>
+        <w:t>- Jobs-to-be-Done:</w:t>
+        <w:br/>
+        <w:t xml:space="preserve">  - J1: Deliver differentiated BCS survivorship care that protects retention/NPS vs SNS, on a fixed FTE budget, while meeting accreditation/quality reporting obligations.</w:t>
+        <w:br/>
+        <w:t xml:space="preserve">  - J2: Surface and intervene on between-consultation deterioration without expanding the senology team or escalating to unscheduled care.</w:t>
+        <w:br/>
+        <w:t>- Pains (each tied to a number):</w:t>
+        <w:br/>
+        <w:t xml:space="preserve">  - P1: &lt;20% of their BCS receive formal psych support today (EV-016) → an undetected affective relapse becomes a churned patient + complaint, directly visible in NPS and quality reporting.</w:t>
+        <w:br/>
+        <w:t xml:space="preserve">  - P2: A psycho-oncologist FTE costs ~EUR 60–80K/yr — not approvable in current budget envelope, yet 30–40% of BCS have clinical anxiety/depression (EV-019).</w:t>
+        <w:br/>
+        <w:t xml:space="preserve">  - P3: Clinician burden / alert overload — senology team has no headroom for unbounded alerts; iNNOVSensing baseline consent at only 34% (EV-041) shows current tooling does not earn its keep.</w:t>
+        <w:br/>
+        <w:t>- Gains (measurable, role-specific):</w:t>
+        <w:br/>
+        <w:t xml:space="preserve">  - G1: NPS / accreditation-visible survivorship metric the head can put in the quality report (alerts caught, time-to-intervention, PHQ-9/GAD-7 trajectory).</w:t>
+        <w:br/>
+        <w:t xml:space="preserve">  - G2: Earlier detection of affective relapse → fewer unscheduled encounters and fewer downstream complaints.</w:t>
+        <w:br/>
+        <w:t xml:space="preserve">  - G3: A second revenue/data line (pharma research-services BT-02, EU grant co-applicant BT-04) running on top of the same deployment, at zero marginal effort to the buyer's team.</w:t>
       </w:r>
     </w:p>
     <w:p>
@@ -225,7 +384,191 @@
           <w:b w:val="0"/>
           <w:sz w:val="20"/>
         </w:rPr>
-        <w:t>• relatorio_saude_mental_digital_v2.html</w:t>
+        <w:t>Value Map (what we offer)</w:t>
+        <w:br/>
+        <w:t>- Products &amp; Services (buyer-facing, not the patient app):</w:t>
+        <w:br/>
+        <w:t xml:space="preserve">  - PS1: Senology-team dashboard with prioritised alerts, PHQ-9/GAD-7 trajectories, and quality-report-ready exports.</w:t>
+        <w:br/>
+        <w:t xml:space="preserve">  - PS2: JITAI sensing + EMA layer running on the BCS patient app, configured for the months-0–24 follow-up pathway.</w:t>
+        <w:br/>
+        <w:t xml:space="preserve">  - PS3: GDPR DPIA + Class I self-certification pack, hospital-DPO co-signed, and a referral-pathway SOP integrated into the senology consultation workflow.</w:t>
+        <w:br/>
+        <w:t>- Pain Relievers (1:1 mapping to Pains):</w:t>
+        <w:br/>
+        <w:t xml:space="preserve">  - PR1 → P1: Closes the &lt;20% psych-support gap (EV-016) by turning the BCS app into a continuously-monitored survivorship channel; missed affective relapses become a measured, reported number.</w:t>
+        <w:br/>
+        <w:t xml:space="preserve">  - PR2 → P2: SaaS at EUR 800–1500/hospital/month (EV-084) ≈ EUR 10–18K/yr — ~5× cheaper than a psycho-oncologist FTE, on opex not headcount.</w:t>
+        <w:br/>
+        <w:t xml:space="preserve">  - PR3 → P3: Alert volume bounded and contracted as a pilot success criterion (≤X alerts/clinician/week, see PoV demands above); referral-pathway integration (Limbic-style, EV-026) prevents free-rider adoption.</w:t>
+        <w:br/>
+        <w:t>- Gain Creators (1:1 mapping to Gains):</w:t>
+        <w:br/>
+        <w:t xml:space="preserve">  - GC1 → G1: Quality-report-ready dashboard exports (PS1) directly populate the head's accreditation/NPS narrative.</w:t>
+        <w:br/>
+        <w:t xml:space="preserve">  - GC2 → G2: AUC 0.78 BCS-specific detection (EV-043) on between-consultation signals → earlier intervention, fewer escalations.</w:t>
+        <w:br/>
+        <w:t xml:space="preserve">  - GC3 → G3: Same deployment is the reference site for pharma research-services contracts (BT-02, EUR 100–300K/study) and EU grant consortia (BT-04) — the buyer becomes the academic anchor without extra effort.</w:t>
+      </w:r>
+    </w:p>
+    <w:p>
+      <w:r>
+        <w:rPr>
+          <w:b w:val="0"/>
+          <w:sz w:val="20"/>
+        </w:rPr>
+        <w:t>VPC mapping is complete: every Pain has a Pain Reliever and every Gain has a Gain Creator. See Open Issues for items where a reliever exists but its magnitude is unproven.</w:t>
+      </w:r>
+    </w:p>
+    <w:p>
+      <w:r>
+        <w:rPr>
+          <w:b/>
+          <w:sz w:val="22"/>
+        </w:rPr>
+        <w:t>Open Issues</w:t>
+        <w:br/>
+        <w:t>- **PR3 magnitude unproven**: the upper bound of "alerts/clinician/week the senology team can absorb" is not quantified (problem.md v2 open issue 3) — the PoV must produce this number or PR3 is aspirational.</w:t>
+        <w:br/>
+        <w:t>- **PR2 conversion unproven**: no signed LOI from CUF/Lusiadas/Luz; the EUR 800–1500/mo price is anchored on EV-084/EV-083, not on a buyer signature.</w:t>
+        <w:br/>
+        <w:t>- **GC2 generalisation**: PerSense AUC 0.78 (EV-043, internal_only, N=126) replication on a fresh PT cohort is the PoV's core scientific test; if it does not hold, GC2 weakens and BT-01/BT-02 inheritance is at risk.</w:t>
+      </w:r>
+    </w:p>
+    <w:p>
+      <w:r>
+        <w:rPr>
+          <w:b/>
+          <w:sz w:val="22"/>
+        </w:rPr>
+        <w:t>Why this thesis over the others (selection rationale)</w:t>
+        <w:br/>
+        <w:t>BT-03 has the highest composite score (23) and the highest PoV alignment (5) — the existing 8–12-week PT senology pilot literally is this thesis, with no redesign required. It is also the fastest to first revenue (6 mo vs 9–30 mo for the alternatives) and capital-light (Class I, &lt;EUR 30K), while still generating the BCS clinical evidence and proprietary data asset that unlock BT-01 (DiGA) and BT-02 (pharma) on expansion — satisfying the Trojan-Horse-with-expansion test.</w:t>
+      </w:r>
+    </w:p>
+    <w:p>
+      <w:r>
+        <w:rPr>
+          <w:b/>
+          <w:sz w:val="22"/>
+        </w:rPr>
+        <w:t>Alternatives kept on the bench (for the Evidence Notes appendix)</w:t>
+        <w:br/>
+        <w:t>- BT-01 — DiGA companion-DTx for BCS survivorship (DE → EU) — composite 16; lost on time-to-revenue (30 mo) and capex (EUR 300–700K MDR IIa) without a DE clinical partner; remains the Yr3+ expansion play.</w:t>
+        <w:br/>
+        <w:t>- BT-02 — Pharma companion / BCS adherence research-services — composite 19; lost on no named pharma counterparty and 6–12 mo procurement; will be layered on top of BT-03 deployments once a reference site exists.</w:t>
+        <w:br/>
+        <w:t>- BT-04 — IPO / public oncology + EU-funded research consortium — composite 18; lost on lumpy non-recurring revenue, ~5.9% EIC success rate (EV-063), and absent PT public-DTx reimbursement pathway; becomes a parallel non-dilutive funding line.</w:t>
+        <w:br/>
+        <w:t>- BT-05 — Insurer survivorship benefit (Medis / Multicare / AdvanceCare) — composite 14; lost on weakest PoV alignment (the pilot does not produce the cost-of-care delta insurers need) and slow PT insurer procurement; revisit once BT-03 generates outcome evidence.</w:t>
+      </w:r>
+    </w:p>
+    <w:p>
+      <w:r>
+        <w:rPr>
+          <w:b/>
+          <w:sz w:val="24"/>
+        </w:rPr>
+        <w:t>Alternative theses considered (one-line each)</w:t>
+      </w:r>
+    </w:p>
+    <w:p>
+      <w:r>
+        <w:rPr>
+          <w:b w:val="0"/>
+          <w:sz w:val="18"/>
+        </w:rPr>
+        <w:t>BT-01 — DiGA companion-DTx for BCS survivorship (DE -&gt; EU) | customer: Statutory Health Insurance funds (GKV, 73M insured) [EV-061] | time-to-revenue: 30 mo | composite: 16 | one-line: BfArM-listed adaptive DTx that detects between-consultation affective relapse in breast-cancer survivors, reimbursed per prescription by German GKV.</w:t>
+      </w:r>
+    </w:p>
+    <w:p>
+      <w:r>
+        <w:rPr>
+          <w:b w:val="0"/>
+          <w:sz w:val="18"/>
+        </w:rPr>
+        <w:t>BT-02 — Pharma companion / BCS adherence research-services | customer: Oncology pharma medical-affairs / RWE / clinical-development teams (Roche, Pfizer, Novartis, AstraZeneca) | time-to-revenue: 9 mo | composite: 19 | one-line: Sell PerSense as a deployed sensing+EMA platform to oncology pharma (Roche/Pfizer/Novartis/AstraZeneca) for adjuvant-therapy adherence and PRO-collection in BCS post-treatment cohorts.</w:t>
+      </w:r>
+    </w:p>
+    <w:p>
+      <w:r>
+        <w:rPr>
+          <w:b w:val="0"/>
+          <w:sz w:val="18"/>
+        </w:rPr>
+        <w:t>BT-04 — IPO / public oncology + EU-funded research consortium | customer: IPO institutions and university hospitals as research-grant co-applicants; ultimate funder = COMPETE 2030 / EIC / FCT | time-to-revenue: 12 mo | composite: 18 | one-line: Deploy PerSense in PT public oncology (IPO Lisboa/Porto/Coimbra) under EU/PT non-dilutive funding (COMPETE 2030, EIC Transition, PRR) as a research-anchored revenue line.</w:t>
+      </w:r>
+    </w:p>
+    <w:p>
+      <w:r>
+        <w:rPr>
+          <w:b w:val="0"/>
+          <w:sz w:val="18"/>
+        </w:rPr>
+        <w:t>BT-05 — Insurer survivorship benefit (Medis Oncologia / Multicare / AdvanceCare) | customer: PT private health insurers: Medis (Ageas), Multicare (Fidelidade), AdvanceCare | time-to-revenue: 15 mo | composite: 14 | one-line: PT private health insurer adds PerSense as a covered benefit inside oncology / survivorship plans, paying per-active-life to reduce escalation cost in BCS post-treatment.</w:t>
+      </w:r>
+    </w:p>
+    <w:p>
+      <w:r>
+        <w:rPr>
+          <w:b/>
+          <w:sz w:val="24"/>
+        </w:rPr>
+        <w:t>Top-5 partner first-contacts (BCS+BT-03)</w:t>
+      </w:r>
+    </w:p>
+    <w:p>
+      <w:r>
+        <w:rPr>
+          <w:b w:val="0"/>
+          <w:sz w:val="18"/>
+        </w:rPr>
+        <w:t>1. PA-001 CUF Senologia (Descobertas / Tejo) — CUF Centros de Senologia — ask: LOI to host 8–12-wk PoV at one site, ≥30 BCS, DPIA co-signed — channel: Warm intro via iNNOVSensing collaborators → CUF Oncologia direction — time-to-LOI: ~6 wk — this-week: Identify head of CUF Senologia; send 1-page buyer brief framing &lt;20% gap as NPS risk</w:t>
+      </w:r>
+    </w:p>
+    <w:p>
+      <w:r>
+        <w:rPr>
+          <w:b w:val="0"/>
+          <w:sz w:val="18"/>
+        </w:rPr>
+        <w:t>2. PA-002 Lusíadas Centro Mama — Lusíadas Centro Mama — ask: LOI to co-host PoV; intro to medical direction; DPO time — channel: Direct email to clinical lead + SPS warm intro — time-to-LOI: ~8 wk — this-week: Cold-email Centro Mama clinical lead; ask for 30-min intro call (not a pitch)</w:t>
+      </w:r>
+    </w:p>
+    <w:p>
+      <w:r>
+        <w:rPr>
+          <w:b w:val="0"/>
+          <w:sz w:val="18"/>
+        </w:rPr>
+        <w:t>3. PA-003 Hospital da Luz Centro Clínico da Mama — Centro Clínico da Mama — ask: LOI for PoV; intro to Luz Saúde innovation + Fidelidade — channel: Luz Saúde innovation team + clinical director — time-to-LOI: ~8 wk — this-week: Scan Luz/Fidelidade press for any 2024–2026 digital-health pilot before cold contact</w:t>
+      </w:r>
+    </w:p>
+    <w:p>
+      <w:r>
+        <w:rPr>
+          <w:b w:val="0"/>
+          <w:sz w:val="18"/>
+        </w:rPr>
+        <w:t>4. PA-004 Sociedade Portuguesa de Senologia (SPS) — Congresso + WG psico-oncologia — ask: Endorsement + intros to CUF/Lusíadas/Luz senology heads + congress slot — channel: SPS board email + member warm intro — time-to-LOI: ~4 wk — this-week: Pull current SPS board; email president + WG lead; ask for 20-min call</w:t>
+      </w:r>
+    </w:p>
+    <w:p>
+      <w:r>
+        <w:rPr>
+          <w:b w:val="0"/>
+          <w:sz w:val="18"/>
+        </w:rPr>
+        <w:t>5. PA-005 IPO Lisboa Psico-Oncologia — Serviço de Psico-Oncologia + Programa de Sobrevivência — ask: Backup PoV-site LOI if private stalls by wk 4; ethics fast-track — channel: iNNOVSensing academic network → IPO Psico-Oncologia — time-to-LOI: ~10 wk — this-week: Identify head of IPO Psico-Oncologia; ask about ethics-committee timelines so wk-4 decision is informed</w:t>
+      </w:r>
+    </w:p>
+    <w:p>
+      <w:r>
+        <w:rPr>
+          <w:b/>
+          <w:sz w:val="24"/>
+        </w:rPr>
+        <w:t>Per-EV provenance (EV-IDs cited on slides)</w:t>
       </w:r>
     </w:p>
     <w:p>
@@ -234,25 +577,502 @@
           <w:b/>
           <w:sz w:val="20"/>
         </w:rPr>
-        <w:t>Sources skipped:</w:t>
+        <w:t>EV-016</w:t>
       </w:r>
     </w:p>
     <w:p>
       <w:r>
         <w:rPr>
           <w:b w:val="0"/>
+          <w:sz w:val="18"/>
+        </w:rPr>
+        <w:t>Claim: Treatment gap em psico-oncologia: &lt;20% dos sobreviventes de cancro da mama recebem apoio psicológico formal.</w:t>
+      </w:r>
+    </w:p>
+    <w:p>
+      <w:r>
+        <w:rPr>
+          <w:b w:val="0"/>
+          <w:sz w:val="18"/>
+        </w:rPr>
+        <w:t>Number: &lt;20% | Topic: access | Confidence: high | Source: relatorio_saude_mental_digital_final (3).html — Epidemiologia</w:t>
+      </w:r>
+    </w:p>
+    <w:p>
+      <w:r>
+        <w:rPr>
+          <w:b w:val="0"/>
+          <w:sz w:val="18"/>
+        </w:rPr>
+        <w:t>Original: "O tratamento gap é crítico: menos de 20% recebe apoio psicológico formal, por escassez de psicooncologistas, distância geográfica, e custo."</w:t>
+      </w:r>
+    </w:p>
+    <w:p>
+      <w:r>
+        <w:rPr>
+          <w:b/>
           <w:sz w:val="20"/>
         </w:rPr>
-        <w:t>• BIG Impact - Problema, Publico e Evidencia.pdf — Slide deck — only process/program text, no quantitative claims to extract.</w:t>
+        <w:t>EV-019</w:t>
       </w:r>
     </w:p>
     <w:p>
       <w:r>
         <w:rPr>
           <w:b w:val="0"/>
+          <w:sz w:val="18"/>
+        </w:rPr>
+        <w:t>Claim: Estima-se que existam mais de 36.000 sobreviventes de cancro da mama em acompanhamento activo em Portugal; 30–40% desenvolvem ansiedade ou depressão clinicamente significativas.</w:t>
+      </w:r>
+    </w:p>
+    <w:p>
+      <w:r>
+        <w:rPr>
+          <w:b w:val="0"/>
+          <w:sz w:val="18"/>
+        </w:rPr>
+        <w:t>Number: &gt;36,000 sobreviventes; 30-40% prevalência ansiedade/depressão | Topic: user_segment | Confidence: high | Source: relatorio_saude_mental_digital_final (3).html — Epidemiologia</w:t>
+      </w:r>
+    </w:p>
+    <w:p>
+      <w:r>
+        <w:rPr>
+          <w:b w:val="0"/>
+          <w:sz w:val="18"/>
+        </w:rPr>
+        <w:t>Original: "Estima-se que existam mais de 36.000 sobreviventes de cancro da mama em Portugal em acompanhamento activo, com 30–40% a desenvolver ansiedade ou depressão clinicamente significativas"</w:t>
+      </w:r>
+    </w:p>
+    <w:p>
+      <w:r>
+        <w:rPr>
+          <w:b/>
           <w:sz w:val="20"/>
         </w:rPr>
-        <w:t>• relatorio_saude_mental_digital_v2.pdf — Identical content to relatorio_saude_mental_digital_v2.html (also superseded by FINAL); skipped to avoid duplication.</w:t>
+        <w:t>EV-020</w:t>
+      </w:r>
+    </w:p>
+    <w:p>
+      <w:r>
+        <w:rPr>
+          <w:b w:val="0"/>
+          <w:sz w:val="18"/>
+        </w:rPr>
+        <w:t>Claim: População alvo BCS: ~750K sobreviventes na UE, 36K em Portugal.</w:t>
+      </w:r>
+    </w:p>
+    <w:p>
+      <w:r>
+        <w:rPr>
+          <w:b w:val="0"/>
+          <w:sz w:val="18"/>
+        </w:rPr>
+        <w:t>Number: ~750K UE; 36K PT | Topic: user_segment | Confidence: high | Source: relatorio_saude_mental_digital_final (3).html — Cinco populações — análise de mercado, evidência e posição competitiva</w:t>
+      </w:r>
+    </w:p>
+    <w:p>
+      <w:r>
+        <w:rPr>
+          <w:b w:val="0"/>
+          <w:sz w:val="18"/>
+        </w:rPr>
+        <w:t>Original: "~750K BCS EU, 36K PT."</w:t>
+      </w:r>
+    </w:p>
+    <w:p>
+      <w:r>
+        <w:rPr>
+          <w:b/>
+          <w:sz w:val="20"/>
+        </w:rPr>
+        <w:t>EV-023</w:t>
+      </w:r>
+    </w:p>
+    <w:p>
+      <w:r>
+        <w:rPr>
+          <w:b w:val="0"/>
+          <w:sz w:val="18"/>
+        </w:rPr>
+        <w:t>Claim: Meta-análise 2025 (N=19.233, 139 RCTs): mHealth reduz ansiedade (SMD=-0.68) e depressão (SMD=-0.49).</w:t>
+      </w:r>
+    </w:p>
+    <w:p>
+      <w:r>
+        <w:rPr>
+          <w:b w:val="0"/>
+          <w:sz w:val="18"/>
+        </w:rPr>
+        <w:t>Number: SMD -0.68 ansiedade; -0.49 depressão; N=19233; 139 RCTs | Topic: digital_health | Confidence: high | Source: relatorio_saude_mental_digital_final (3).html — Cinco populações — análise de mercado, evidência e posição competitiva</w:t>
+      </w:r>
+    </w:p>
+    <w:p>
+      <w:r>
+        <w:rPr>
+          <w:b w:val="0"/>
+          <w:sz w:val="18"/>
+        </w:rPr>
+        <w:t>Original: "Meta-análise 2025 (N=19.233, 139 RCTs): mHealth reduz ansiedade (SMD=-0.68) e depressão (SMD=-0.49)."</w:t>
+      </w:r>
+    </w:p>
+    <w:p>
+      <w:r>
+        <w:rPr>
+          <w:b/>
+          <w:sz w:val="20"/>
+        </w:rPr>
+        <w:t>EV-026</w:t>
+      </w:r>
+    </w:p>
+    <w:p>
+      <w:r>
+        <w:rPr>
+          <w:b w:val="0"/>
+          <w:sz w:val="18"/>
+        </w:rPr>
+        <w:t>Claim: Limbic AI atinge 33% dos referenciamentos NHS (modelo de integração mediado).</w:t>
+      </w:r>
+    </w:p>
+    <w:p>
+      <w:r>
+        <w:rPr>
+          <w:b w:val="0"/>
+          <w:sz w:val="18"/>
+        </w:rPr>
+        <w:t>Number: 33% | Topic: digital_health | Confidence: high | Source: relatorio_saude_mental_digital_final (3).html — Desafio 1 — Baixas taxas de consentimento</w:t>
+      </w:r>
+    </w:p>
+    <w:p>
+      <w:r>
+        <w:rPr>
+          <w:b w:val="0"/>
+          <w:sz w:val="18"/>
+        </w:rPr>
+        <w:t>Original: "Limbic AI: integração no referral pathway NHS aumentou adoption para 33% de todos os referenciamentos."</w:t>
+      </w:r>
+    </w:p>
+    <w:p>
+      <w:r>
+        <w:rPr>
+          <w:b/>
+          <w:sz w:val="20"/>
+        </w:rPr>
+        <w:t>EV-038</w:t>
+      </w:r>
+    </w:p>
+    <w:p>
+      <w:r>
+        <w:rPr>
+          <w:b w:val="0"/>
+          <w:sz w:val="18"/>
+        </w:rPr>
+        <w:t>Claim: mindLAMP deployment: Docker auto-hospedável em Hetzner (DE, GDPR), €30–50/mês.</w:t>
+      </w:r>
+    </w:p>
+    <w:p>
+      <w:r>
+        <w:rPr>
+          <w:b w:val="0"/>
+          <w:sz w:val="18"/>
+        </w:rPr>
+        <w:t>Number: €30-50/mês | Topic: platform | Confidence: high | Source: relatorio_saude_mental_digital_final (3).html — Análise comparativa das seis plataformas OSS relevantes</w:t>
+      </w:r>
+    </w:p>
+    <w:p>
+      <w:r>
+        <w:rPr>
+          <w:b w:val="0"/>
+          <w:sz w:val="18"/>
+        </w:rPr>
+        <w:t>Original: "Deployment: Docker, auto-hospedável em Hetzner (DE, GDPR), €30-50/mês."</w:t>
+      </w:r>
+    </w:p>
+    <w:p>
+      <w:r>
+        <w:rPr>
+          <w:b/>
+          <w:sz w:val="20"/>
+        </w:rPr>
+        <w:t>EV-039</w:t>
+      </w:r>
+    </w:p>
+    <w:p>
+      <w:r>
+        <w:rPr>
+          <w:b w:val="0"/>
+          <w:sz w:val="18"/>
+        </w:rPr>
+        <w:t>Claim: iOS restringe background sensing — cobertura de sensores 40–50% do que Android fornece.</w:t>
+      </w:r>
+    </w:p>
+    <w:p>
+      <w:r>
+        <w:rPr>
+          <w:b w:val="0"/>
+          <w:sz w:val="18"/>
+        </w:rPr>
+        <w:t>Number: 40-50% | Topic: platform | Confidence: medium | Source: oss_platform_analysis.html — As seis plataformas open-source</w:t>
+      </w:r>
+    </w:p>
+    <w:p>
+      <w:r>
+        <w:rPr>
+          <w:b w:val="0"/>
+          <w:sz w:val="18"/>
+        </w:rPr>
+        <w:t>Original: "iOS restringe background sensing — cobertura de sensores 40-50% do que Android fornece."</w:t>
+      </w:r>
+    </w:p>
+    <w:p>
+      <w:r>
+        <w:rPr>
+          <w:b/>
+          <w:sz w:val="20"/>
+        </w:rPr>
+        <w:t>EV-040</w:t>
+      </w:r>
+    </w:p>
+    <w:p>
+      <w:r>
+        <w:rPr>
+          <w:b w:val="0"/>
+          <w:sz w:val="18"/>
+        </w:rPr>
+        <w:t>Claim: Beiwe: compliance 43% EMA + 43% JITAI reportada na literatura.</w:t>
+      </w:r>
+    </w:p>
+    <w:p>
+      <w:r>
+        <w:rPr>
+          <w:b w:val="0"/>
+          <w:sz w:val="18"/>
+        </w:rPr>
+        <w:t>Number: 43% EMA; 43% JITAI | Topic: platform | Confidence: medium | Source: oss_platform_analysis.html — Papel na arquitectura PerSense</w:t>
+      </w:r>
+    </w:p>
+    <w:p>
+      <w:r>
+        <w:rPr>
+          <w:b w:val="0"/>
+          <w:sz w:val="18"/>
+        </w:rPr>
+        <w:t>Original: "Compliance de 43% EMA + 43% JITAI reportada."</w:t>
+      </w:r>
+    </w:p>
+    <w:p>
+      <w:r>
+        <w:rPr>
+          <w:b/>
+          <w:sz w:val="20"/>
+        </w:rPr>
+        <w:t>EV-043</w:t>
+      </w:r>
+    </w:p>
+    <w:p>
+      <w:r>
+        <w:rPr>
+          <w:b w:val="0"/>
+          <w:sz w:val="18"/>
+        </w:rPr>
+        <w:t>Claim: ML PerSense: AUC 0,78 para depressão em BCS, validado em N=126 pacientes em 2 hospitais.</w:t>
+      </w:r>
+    </w:p>
+    <w:p>
+      <w:r>
+        <w:rPr>
+          <w:b w:val="0"/>
+          <w:sz w:val="18"/>
+        </w:rPr>
+        <w:t>Number: AUC 0.78; N=126 | Topic: pilot_metric | Confidence: high | Source: relatorio_estrategico_master_persense.html — Síntese final — o argumento de investimento</w:t>
+      </w:r>
+    </w:p>
+    <w:p>
+      <w:r>
+        <w:rPr>
+          <w:b w:val="0"/>
+          <w:sz w:val="18"/>
+        </w:rPr>
+        <w:t>Original: "o único produto europeu de DP adaptativo para saúde mental em BCS, com dados reais de N=126 pacientes e ML validado em dois hospitais (AUC 0.78 depressão)."</w:t>
+      </w:r>
+    </w:p>
+    <w:p>
+      <w:r>
+        <w:rPr>
+          <w:b/>
+          <w:sz w:val="20"/>
+        </w:rPr>
+        <w:t>EV-046</w:t>
+      </w:r>
+    </w:p>
+    <w:p>
+      <w:r>
+        <w:rPr>
+          <w:b w:val="0"/>
+          <w:sz w:val="18"/>
+        </w:rPr>
+        <w:t>Claim: Custo total do piloto PoV proposto: €5–10K (developer 30h €3–6K + infra mindLAMP €120 + 10 Fitbits €2–3K).</w:t>
+      </w:r>
+    </w:p>
+    <w:p>
+      <w:r>
+        <w:rPr>
+          <w:b w:val="0"/>
+          <w:sz w:val="18"/>
+        </w:rPr>
+        <w:t>Number: €5-10K | Topic: pilot_metric | Confidence: high | Source: relatorio_saude_mental_digital_final (3).html — Cronograma do piloto PoV</w:t>
+      </w:r>
+    </w:p>
+    <w:p>
+      <w:r>
+        <w:rPr>
+          <w:b w:val="0"/>
+          <w:sz w:val="18"/>
+        </w:rPr>
+        <w:t>Original: "Developer time (30h): €3–6K. Infraestrutura (mindLAMP Hetzner 3 meses): €120. Fitbits para sensing (10 unidades, reutilizáveis): €2–3K. Total: €5–10K."</w:t>
+      </w:r>
+    </w:p>
+    <w:p>
+      <w:r>
+        <w:rPr>
+          <w:b/>
+          <w:sz w:val="20"/>
+        </w:rPr>
+        <w:t>EV-047</w:t>
+      </w:r>
+    </w:p>
+    <w:p>
+      <w:r>
+        <w:rPr>
+          <w:b w:val="0"/>
+          <w:sz w:val="18"/>
+        </w:rPr>
+        <w:t>Claim: Métricas de sucesso PoV: ≥2 terapeutas/hospitais pagariam ≥€200/mês; ≥70% dados em ≥80% participantes; ≥50% pacientes elegíveis abordados.</w:t>
+      </w:r>
+    </w:p>
+    <w:p>
+      <w:r>
+        <w:rPr>
+          <w:b w:val="0"/>
+          <w:sz w:val="18"/>
+        </w:rPr>
+        <w:t>Number: &gt;=2 buyers @ €200/mês; &gt;=70% data; &gt;=50% approached | Topic: pilot_metric | Confidence: high | Source: relatorio_saude_mental_digital_final (3).html — Métricas de sucesso do PoV</w:t>
+      </w:r>
+    </w:p>
+    <w:p>
+      <w:r>
+        <w:rPr>
+          <w:b w:val="0"/>
+          <w:sz w:val="18"/>
+        </w:rPr>
+        <w:t>Original: "≥2 terapeutas/hospitais afirmam que pagariam ≥€200/mês pelo produto. ≥70% dados esperados recolhidos em ≥80% dos participantes. ≥50% pacientes elegíveis abordados."</w:t>
+      </w:r>
+    </w:p>
+    <w:p>
+      <w:r>
+        <w:rPr>
+          <w:b/>
+          <w:sz w:val="20"/>
+        </w:rPr>
+        <w:t>EV-048</w:t>
+      </w:r>
+    </w:p>
+    <w:p>
+      <w:r>
+        <w:rPr>
+          <w:b w:val="0"/>
+          <w:sz w:val="18"/>
+        </w:rPr>
+        <w:t>Claim: iNNOVSensing custou €120K para produzir dados equivalentes em valor estratégico ao piloto PoV proposto.</w:t>
+      </w:r>
+    </w:p>
+    <w:p>
+      <w:r>
+        <w:rPr>
+          <w:b w:val="0"/>
+          <w:sz w:val="18"/>
+        </w:rPr>
+        <w:t>Number: €120K | Topic: pilot_metric | Confidence: medium | Source: relatorio_saude_mental_digital_final (3).html — Cronograma do piloto PoV</w:t>
+      </w:r>
+    </w:p>
+    <w:p>
+      <w:r>
+        <w:rPr>
+          <w:b w:val="0"/>
+          <w:sz w:val="18"/>
+        </w:rPr>
+        <w:t>Original: "Por comparação, o iNNOVSensing custou €120K para produzir dados equivalentes em termos de valor estratégico para a startup."</w:t>
+      </w:r>
+    </w:p>
+    <w:p>
+      <w:r>
+        <w:rPr>
+          <w:b/>
+          <w:sz w:val="20"/>
+        </w:rPr>
+        <w:t>EV-060</w:t>
+      </w:r>
+    </w:p>
+    <w:p>
+      <w:r>
+        <w:rPr>
+          <w:b w:val="0"/>
+          <w:sz w:val="18"/>
+        </w:rPr>
+        <w:t>Claim: Reembolso DiGA pago por GKV: €200–600/paciente/ano.</w:t>
+      </w:r>
+    </w:p>
+    <w:p>
+      <w:r>
+        <w:rPr>
+          <w:b w:val="0"/>
+          <w:sz w:val="18"/>
+        </w:rPr>
+        <w:t>Number: €200-600/paciente/ano | Topic: cost | Confidence: high | Source: relatorio_saude_mental_digital_final (3).html — Modelos de Desenvolvimento: DiGA</w:t>
+      </w:r>
+    </w:p>
+    <w:p>
+      <w:r>
+        <w:rPr>
+          <w:b w:val="0"/>
+          <w:sz w:val="18"/>
+        </w:rPr>
+        <w:t>Original: "reembolso automático pós-aprovação (€200–600/paciente/ano directo das GKV)."</w:t>
+      </w:r>
+    </w:p>
+    <w:p>
+      <w:r>
+        <w:rPr>
+          <w:b/>
+          <w:sz w:val="20"/>
+        </w:rPr>
+        <w:t>EV-062</w:t>
+      </w:r>
+    </w:p>
+    <w:p>
+      <w:r>
+        <w:rPr>
+          <w:b w:val="0"/>
+          <w:sz w:val="18"/>
+        </w:rPr>
+        <w:t>Claim: GDPR: multa activa de €2,3M aplicada a desenvolvedor de mental health app na Irlanda.</w:t>
+      </w:r>
+    </w:p>
+    <w:p>
+      <w:r>
+        <w:rPr>
+          <w:b w:val="0"/>
+          <w:sz w:val="18"/>
+        </w:rPr>
+        <w:t>Number: €2.3M | Topic: cost | Confidence: high | Source: relatorio_saude_mental_digital_final (3).html — Os quatro pilares regulatórios</w:t>
+      </w:r>
+    </w:p>
+    <w:p>
+      <w:r>
+        <w:rPr>
+          <w:b w:val="0"/>
+          <w:sz w:val="18"/>
+        </w:rPr>
+        <w:t>Original: "Fines activos (€2,3M a desenvolvedor de mental health app em Irlanda)."</w:t>
       </w:r>
     </w:p>
     <w:p>
@@ -261,16 +1081,196 @@
           <w:b/>
           <w:sz w:val="24"/>
         </w:rPr>
-        <w:t>Methodology</w:t>
+        <w:t>Open Issues / Não Resolvido (aggregated)</w:t>
+      </w:r>
+    </w:p>
+    <w:p>
+      <w:r>
+        <w:rPr>
+          <w:b/>
+          <w:sz w:val="20"/>
+        </w:rPr>
+        <w:t>From problem.md:</w:t>
       </w:r>
     </w:p>
     <w:p>
       <w:r>
         <w:rPr>
           <w:b w:val="0"/>
+          <w:sz w:val="18"/>
+        </w:rPr>
+        <w:t>• **Generalização da AUC 0.78** — modelo treinado em 2 hospitais com N=126; sem validação out-of-sample em coorte independente. Risco: o sinal preditivo não replica fora do iNNOVSensing. Próximo passo: piloto PoV deve incluir hold-out externo ou hospital novo.</w:t>
+      </w:r>
+    </w:p>
+    <w:p>
+      <w:r>
+        <w:rPr>
+          <w:b w:val="0"/>
+          <w:sz w:val="18"/>
+        </w:rPr>
+        <w:t>• **Aceitação BCS no mundo real (consent 34%, screen-fail 52.7%)** — internamente conhecido, externamente invisível. Não sabemos se variação de protocolo (onboarding hospitalar mediado, redução de wearables, EMA mais curta) move o consent para ≥50%. É a primeira coisa que o piloto tem de testar.</w:t>
+      </w:r>
+    </w:p>
+    <w:p>
+      <w:r>
+        <w:rPr>
+          <w:b w:val="0"/>
+          <w:sz w:val="18"/>
+        </w:rPr>
+        <w:t>• **Carga clínica para a equipa hospitalar** — não medida. Quantos alertas/semana a equipa de senologia consegue triar sem perda de qualidade? Sem este número, o buyer story colapsa.</w:t>
+      </w:r>
+    </w:p>
+    <w:p>
+      <w:r>
+        <w:rPr>
+          <w:b w:val="0"/>
+          <w:sz w:val="18"/>
+        </w:rPr>
+        <w:t>• **Definição operacional de "contacto útil"** — "dias até contacto" precisa de operacionalização (telefonema clínico vs consulta presencial vs mensagem segura via app). A definir antes do piloto.</w:t>
+      </w:r>
+    </w:p>
+    <w:p>
+      <w:r>
+        <w:rPr>
+          <w:b w:val="0"/>
+          <w:sz w:val="18"/>
+        </w:rPr>
+        <w:t>• **EV-019 vs EV-016 sobreposição** — o "30–40% desenvolvem" e o "&lt;20% recebem apoio" combinam-se para uma "treatment gap" implícita; a forma exata da gap (% de mulheres com ansiedade/depressão clínica que NÃO recebem apoio) não é uma estatística citada diretamente, é uma inferência. Surface-level honesto: surfaced here, not silenced.</w:t>
+      </w:r>
+    </w:p>
+    <w:p>
+      <w:r>
+        <w:rPr>
+          <w:b w:val="0"/>
+          <w:sz w:val="18"/>
+        </w:rPr>
+        <w:t>• **iOS sensing penalty** — se o piloto usa Beiwe/mindLAMP, a cobertura de sensores em iOS é 40–50% da de Android [EV-039]. Pode enviesar quem entra no piloto. Mitigação: documentar mix iOS/Android nos resultados. ---</w:t>
+      </w:r>
+    </w:p>
+    <w:p>
+      <w:r>
+        <w:rPr>
+          <w:b/>
           <w:sz w:val="20"/>
         </w:rPr>
-        <w:t>Quantitative claims foram extraídos automaticamente dos PDFs e HTMLs do dossier (scripts/extract_text.py + find_claims.py + build_ledger.py), atribuídos um EV-ID estável (EV-001…EV-088), categorizados por tópico (prevalence, access, user_segment, digital_health, platform, pilot_metric, cost, other) e normalizados para um JSON ledger. Cada claim citado nas peças (problem, value, evidence_table, pilot) referencia o seu EV-ID; este documento lista as notas para os IDs efectivamente usados na deck.</w:t>
+        <w:t>From value.md:</w:t>
+      </w:r>
+    </w:p>
+    <w:p>
+      <w:r>
+        <w:rPr>
+          <w:b w:val="0"/>
+          <w:sz w:val="18"/>
+        </w:rPr>
+        <w:t>• **Replicação out-of-sample da AUC 0.78 [EV-043, internal_only]** — modelo treinado em 2 hospitais; sem hold-out PT independente. Se não replicar a ≥0.72, a métrica principal colapsa parcialmente (delta PHQ-9/GAD-7 ainda pode existir, mas o "detection moat" cai). Esta é a aposta científica central do piloto.</w:t>
+      </w:r>
+    </w:p>
+    <w:p>
+      <w:r>
+        <w:rPr>
+          <w:b w:val="0"/>
+          <w:sz w:val="18"/>
+        </w:rPr>
+        <w:t>• **Bound numérico de "alertas/clínico/semana absorvíveis" não negociado** — o teto de 2/semana é proposto pela tese mas não tem assinatura da equipa de senologia. Sem confirmação por escrito antes do kickoff, o suporte 1 fica indefenido.</w:t>
+      </w:r>
+    </w:p>
+    <w:p>
+      <w:r>
+        <w:rPr>
+          <w:b w:val="0"/>
+          <w:sz w:val="18"/>
+        </w:rPr>
+        <w:t>• **Conversão LOI sem âncora hospitalar pré-existente** — não há LOI assinado de CUF/Lusíadas/Luz Saúde. €200/mês é threshold mínimo [EV-047]; o pricing-alvo BT-03 (€800–1500/mês) só se valida após o piloto. Risco: se 0–1 LOI assinado até semana 12, o suporte 2 falha e BT-03 colapsa — fallback é BT-04 (consórcio EU) com tempo de revenue muito maior.</w:t>
+      </w:r>
+    </w:p>
+    <w:p>
+      <w:r>
+        <w:rPr>
+          <w:b w:val="0"/>
+          <w:sz w:val="18"/>
+        </w:rPr>
+        <w:t>• **iOS sensing penalty** — cobertura sensores iOS 40–50% vs Android [EV-039] pode enviesar a coorte com replicação AUC. Mitigação: report do mix iOS/Android e estratificação dos resultados.</w:t>
+      </w:r>
+    </w:p>
+    <w:p>
+      <w:r>
+        <w:rPr>
+          <w:b w:val="0"/>
+          <w:sz w:val="18"/>
+        </w:rPr>
+        <w:t>• **EMA compliance baseline 43% [EV-040]** — se replicar Beiwe, metade das BCS não responde aos EMA; precisão/recall medidos só sobre os respondentes pode inflacionar artificialmente os números. Mitigação: report explícito de denominator (intent-to-treat vs respondent-only). ---</w:t>
+      </w:r>
+    </w:p>
+    <w:p>
+      <w:r>
+        <w:rPr>
+          <w:b/>
+          <w:sz w:val="20"/>
+        </w:rPr>
+        <w:t>From pilot.md:</w:t>
+      </w:r>
+    </w:p>
+    <w:p>
+      <w:r>
+        <w:rPr>
+          <w:b w:val="0"/>
+          <w:sz w:val="18"/>
+        </w:rPr>
+        <w:t>• **Bound de alertas/clínico/semana ainda não assinado pela equipa de senologia** — proposto a 2/semana; sem assinatura por escrito, o pressuposto 1 fica aspiracional. Resolver antes do kickoff (semana -2).</w:t>
+      </w:r>
+    </w:p>
+    <w:p>
+      <w:r>
+        <w:rPr>
+          <w:b w:val="0"/>
+          <w:sz w:val="18"/>
+        </w:rPr>
+        <w:t>• **Nenhuma LOI pré-existente de CUF/Lusíadas/Luz Saúde** — pricing €200/mês é threshold mínimo [EV-047]; sem prospect concreto até semana 4, ativar IPO backup. Pressuposto 3 é a aposta comercial central.</w:t>
+      </w:r>
+    </w:p>
+    <w:p>
+      <w:r>
+        <w:rPr>
+          <w:b w:val="0"/>
+          <w:sz w:val="18"/>
+        </w:rPr>
+        <w:t>• **Definição operacional de "contacto clínico útil"** — telefone clínico, mensagem segura, ou consulta antecipada? A definir no protocolo na semana -1 (herda de problem.md open issue 4).</w:t>
+      </w:r>
+    </w:p>
+    <w:p>
+      <w:r>
+        <w:rPr>
+          <w:b w:val="0"/>
+          <w:sz w:val="18"/>
+        </w:rPr>
+        <w:t>• **iOS sensing penalty** [EV-039] — cobertura de sensores iOS 40–50% vs Android pode enviesar a coorte; mitigação: report estratificado iOS/Android.</w:t>
+      </w:r>
+    </w:p>
+    <w:p>
+      <w:r>
+        <w:rPr>
+          <w:b w:val="0"/>
+          <w:sz w:val="18"/>
+        </w:rPr>
+        <w:t>• **EMA compliance baseline 43%** [EV-040] — denominator-risk em precisão/recall; mitigação: report intent-to-treat + respondent-only.</w:t>
+      </w:r>
+    </w:p>
+    <w:p>
+      <w:r>
+        <w:rPr>
+          <w:b w:val="0"/>
+          <w:sz w:val="18"/>
+        </w:rPr>
+        <w:t>• **Hold-out design para AUC** — não decidido se random hold-out ou novo hospital (mais defensável mas mais lento). Decidir na semana -1 com biostat advisor.</w:t>
+      </w:r>
+    </w:p>
+    <w:p>
+      <w:r>
+        <w:rPr>
+          <w:b w:val="0"/>
+          <w:sz w:val="18"/>
+        </w:rPr>
+        <w:t>• **Backup IPO altera modelo de revenue** (BT-04 consórcio EU vez de BT-03 SaaS) — se ativado, o piloto valida ciência mas não tese comercial; necessário gate explícito na semana 4. ---</w:t>
       </w:r>
     </w:p>
     <w:p>
@@ -279,25 +1279,7 @@
           <w:b/>
           <w:sz w:val="24"/>
         </w:rPr>
-        <w:t>Per-claim notes (EV-IDs cited in deck)</w:t>
-      </w:r>
-    </w:p>
-    <w:p>
-      <w:r>
-        <w:rPr>
-          <w:b/>
-          <w:sz w:val="22"/>
-        </w:rPr>
-        <w:t>EV-005</w:t>
-      </w:r>
-    </w:p>
-    <w:p>
-      <w:r>
-        <w:rPr>
-          <w:b w:val="0"/>
-          <w:sz w:val="20"/>
-        </w:rPr>
-        <w:t>Claim: Em estudo 2024 com 3.399 estudantes universitários portugueses, 75% reportaram sintomas de ansiedade e 61,2% sintomas depressivos (ligeiros a graves).</w:t>
+        <w:t>Coverage check</w:t>
       </w:r>
     </w:p>
     <w:p>
@@ -306,7 +1288,7 @@
           <w:b w:val="0"/>
           <w:sz w:val="18"/>
         </w:rPr>
-        <w:t>Number: 75% ansiedade; 61.2% depressão; N=3399  |  Metric: prevalence_pct  |  Topic: prevalence  |  Confidence: high</w:t>
+        <w:t>EV-IDs cited in deck: 14 — EV-016, EV-019, EV-020, EV-023, EV-026, EV-038, EV-039, EV-040, EV-043, EV-046, EV-047, EV-048, EV-060, EV-062</w:t>
       </w:r>
     </w:p>
     <w:p>
@@ -315,7 +1297,16 @@
           <w:b w:val="0"/>
           <w:sz w:val="18"/>
         </w:rPr>
-        <w:t>Source: relatorio_saude_mental_digital_final (3).html — Prevalência e carga de doença</w:t>
+        <w:t>EV-IDs documented in this notes file: 14 — EV-016, EV-019, EV-020, EV-023, EV-026, EV-038, EV-039, EV-040, EV-043, EV-046, EV-047, EV-048, EV-060, EV-062</w:t>
+      </w:r>
+    </w:p>
+    <w:p>
+      <w:r>
+        <w:rPr>
+          <w:b/>
+          <w:sz w:val="24"/>
+        </w:rPr>
+        <w:t>Sources scanned (internal dossier)</w:t>
       </w:r>
     </w:p>
     <w:p>
@@ -324,7 +1315,7 @@
           <w:b w:val="0"/>
           <w:sz w:val="18"/>
         </w:rPr>
-        <w:t>Original context: "Num estudo de 2024 com 3.399 estudantes universitários portugueses (Amaro et al.), 75% reportaram sintomas de ansiedade ligeiros a graves e 61,2% sintomas depressivos ligeiros a graves."</w:t>
+        <w:t>• Big Impact - Problem Definition Case Challenge.pdf</w:t>
       </w:r>
     </w:p>
     <w:p>
@@ -333,25 +1324,7 @@
           <w:b w:val="0"/>
           <w:sz w:val="18"/>
         </w:rPr>
-        <w:t>Notes: Fonte: Amaro et al. 2024.</w:t>
-      </w:r>
-    </w:p>
-    <w:p>
-      <w:r>
-        <w:rPr>
-          <w:b/>
-          <w:sz w:val="22"/>
-        </w:rPr>
-        <w:t>EV-012</w:t>
-      </w:r>
-    </w:p>
-    <w:p>
-      <w:r>
-        <w:rPr>
-          <w:b w:val="0"/>
-          <w:sz w:val="20"/>
-        </w:rPr>
-        <w:t>Claim: O SNS conta com aproximadamente 1.100 psicólogos para uma população de 10,3 milhões — muito abaixo do objetivo legal de 1 psicólogo por 5.000 habitantes.</w:t>
+        <w:t>• oss_platform_analysis.html</w:t>
       </w:r>
     </w:p>
     <w:p>
@@ -360,7 +1333,7 @@
           <w:b w:val="0"/>
           <w:sz w:val="18"/>
         </w:rPr>
-        <w:t>Number: ~1100 psicólogos; ratio ~1:9.400; objetivo 1:5000  |  Metric: provider_ratio  |  Topic: access  |  Confidence: high</w:t>
+        <w:t>• relatorio_estrategico_master_persense.html</w:t>
       </w:r>
     </w:p>
     <w:p>
@@ -369,7 +1342,7 @@
           <w:b w:val="0"/>
           <w:sz w:val="18"/>
         </w:rPr>
-        <w:t>Source: relatorio_saude_mental_digital_final (3).html — Serviços de saúde mental: estrutura e défices</w:t>
+        <w:t>• relatorio_saude_mental_digital_final (3).html</w:t>
       </w:r>
     </w:p>
     <w:p>
@@ -378,403 +1351,7 @@
           <w:b w:val="0"/>
           <w:sz w:val="18"/>
         </w:rPr>
-        <w:t>Original context: "O SNS conta com aproximadamente 1.100 psicólogos para uma população de 10,3 milhões — um rácio muito abaixo do objetivo legal de 1 psicólogo por 5.000 habitantes (Resolução da AR n.º 158/2021)."</w:t>
-      </w:r>
-    </w:p>
-    <w:p>
-      <w:r>
-        <w:rPr>
-          <w:b w:val="0"/>
-          <w:sz w:val="18"/>
-        </w:rPr>
-        <w:t>Notes: Fonte: Resolução AR n.º 158/2021.</w:t>
-      </w:r>
-    </w:p>
-    <w:p>
-      <w:r>
-        <w:rPr>
-          <w:b/>
-          <w:sz w:val="22"/>
-        </w:rPr>
-        <w:t>EV-013</w:t>
-      </w:r>
-    </w:p>
-    <w:p>
-      <w:r>
-        <w:rPr>
-          <w:b w:val="0"/>
-          <w:sz w:val="20"/>
-        </w:rPr>
-        <w:t>Claim: Em 2024 o tempo médio de espera para consulta de psicologia ultrapassava 300 dias em Santarém, 254 em Aveiro e 240 em Chaves.</w:t>
-      </w:r>
-    </w:p>
-    <w:p>
-      <w:r>
-        <w:rPr>
-          <w:b w:val="0"/>
-          <w:sz w:val="18"/>
-        </w:rPr>
-        <w:t>Number: 300 dias Santarém; 254 Aveiro; 240 Chaves  |  Metric: wait_time_days  |  Topic: access  |  Confidence: high</w:t>
-      </w:r>
-    </w:p>
-    <w:p>
-      <w:r>
-        <w:rPr>
-          <w:b w:val="0"/>
-          <w:sz w:val="18"/>
-        </w:rPr>
-        <w:t>Source: relatorio_saude_mental_digital_final (3).html — Serviços de saúde mental: estrutura e défices</w:t>
-      </w:r>
-    </w:p>
-    <w:p>
-      <w:r>
-        <w:rPr>
-          <w:b w:val="0"/>
-          <w:sz w:val="18"/>
-        </w:rPr>
-        <w:t>Original context: "Em 2024, o tempo médio de espera para consulta de psicologia ultrapassava 300 dias em Santarém, 254 em Aveiro e 240 em Chaves."</w:t>
-      </w:r>
-    </w:p>
-    <w:p>
-      <w:r>
-        <w:rPr>
-          <w:b/>
-          <w:sz w:val="22"/>
-        </w:rPr>
-        <w:t>EV-021</w:t>
-      </w:r>
-    </w:p>
-    <w:p>
-      <w:r>
-        <w:rPr>
-          <w:b w:val="0"/>
-          <w:sz w:val="20"/>
-        </w:rPr>
-        <w:t>Claim: Adoption esperada de DP mediada por clínico vs autónoma: 60–70% (cuidado padrão) vs 30–40% (auto-referenciamento).</w:t>
-      </w:r>
-    </w:p>
-    <w:p>
-      <w:r>
-        <w:rPr>
-          <w:b w:val="0"/>
-          <w:sz w:val="18"/>
-        </w:rPr>
-        <w:t>Number: 60-70% vs 30-40%  |  Metric: adoption_pct  |  Topic: user_segment  |  Confidence: medium</w:t>
-      </w:r>
-    </w:p>
-    <w:p>
-      <w:r>
-        <w:rPr>
-          <w:b w:val="0"/>
-          <w:sz w:val="18"/>
-        </w:rPr>
-        <w:t>Source: relatorio_estrategico_master_persense.html — Modelo clinician-mediated vs autonomous JITAI</w:t>
-      </w:r>
-    </w:p>
-    <w:p>
-      <w:r>
-        <w:rPr>
-          <w:b w:val="0"/>
-          <w:sz w:val="18"/>
-        </w:rPr>
-        <w:t>Original context: "60–70% (contexto de cuidado padrão); 30–40% (auto-referenciamento)."</w:t>
-      </w:r>
-    </w:p>
-    <w:p>
-      <w:r>
-        <w:rPr>
-          <w:b/>
-          <w:sz w:val="22"/>
-        </w:rPr>
-        <w:t>EV-023</w:t>
-      </w:r>
-    </w:p>
-    <w:p>
-      <w:r>
-        <w:rPr>
-          <w:b w:val="0"/>
-          <w:sz w:val="20"/>
-        </w:rPr>
-        <w:t>Claim: Meta-análise 2025 (N=19.233, 139 RCTs): mHealth reduz ansiedade (SMD=-0.68) e depressão (SMD=-0.49).</w:t>
-      </w:r>
-    </w:p>
-    <w:p>
-      <w:r>
-        <w:rPr>
-          <w:b w:val="0"/>
-          <w:sz w:val="18"/>
-        </w:rPr>
-        <w:t>Number: SMD -0.68 ansiedade; -0.49 depressão; N=19233; 139 RCTs  |  Metric: effect_size_smd  |  Topic: digital_health  |  Confidence: high</w:t>
-      </w:r>
-    </w:p>
-    <w:p>
-      <w:r>
-        <w:rPr>
-          <w:b w:val="0"/>
-          <w:sz w:val="18"/>
-        </w:rPr>
-        <w:t>Source: relatorio_saude_mental_digital_final (3).html — Cinco populações — análise de mercado, evidência e posição competitiva</w:t>
-      </w:r>
-    </w:p>
-    <w:p>
-      <w:r>
-        <w:rPr>
-          <w:b w:val="0"/>
-          <w:sz w:val="18"/>
-        </w:rPr>
-        <w:t>Original context: "Meta-análise 2025 (N=19.233, 139 RCTs): mHealth reduz ansiedade (SMD=-0.68) e depressão (SMD=-0.49)."</w:t>
-      </w:r>
-    </w:p>
-    <w:p>
-      <w:r>
-        <w:rPr>
-          <w:b/>
-          <w:sz w:val="22"/>
-        </w:rPr>
-        <w:t>EV-031</w:t>
-      </w:r>
-    </w:p>
-    <w:p>
-      <w:r>
-        <w:rPr>
-          <w:b w:val="0"/>
-          <w:sz w:val="20"/>
-        </w:rPr>
-        <w:t>Claim: Wysa (parceria MassMutual): 30% redução em GAD-7; integrado no NHS.</w:t>
-      </w:r>
-    </w:p>
-    <w:p>
-      <w:r>
-        <w:rPr>
-          <w:b w:val="0"/>
-          <w:sz w:val="18"/>
-        </w:rPr>
-        <w:t>Number: -30% GAD-7  |  Metric: symptom_reduction_pct  |  Topic: digital_health  |  Confidence: medium</w:t>
-      </w:r>
-    </w:p>
-    <w:p>
-      <w:r>
-        <w:rPr>
-          <w:b w:val="0"/>
-          <w:sz w:val="18"/>
-        </w:rPr>
-        <w:t>Source: relatorio_saude_mental_digital_final (3).html — Players Adjacentes Relevantes</w:t>
-      </w:r>
-    </w:p>
-    <w:p>
-      <w:r>
-        <w:rPr>
-          <w:b w:val="0"/>
-          <w:sz w:val="18"/>
-        </w:rPr>
-        <w:t>Original context: "30% redução GAD-7; parceria MassMutual; NHS integrated."</w:t>
-      </w:r>
-    </w:p>
-    <w:p>
-      <w:r>
-        <w:rPr>
-          <w:b/>
-          <w:sz w:val="22"/>
-        </w:rPr>
-        <w:t>EV-040</w:t>
-      </w:r>
-    </w:p>
-    <w:p>
-      <w:r>
-        <w:rPr>
-          <w:b w:val="0"/>
-          <w:sz w:val="20"/>
-        </w:rPr>
-        <w:t>Claim: Beiwe: compliance 43% EMA + 43% JITAI reportada na literatura.</w:t>
-      </w:r>
-    </w:p>
-    <w:p>
-      <w:r>
-        <w:rPr>
-          <w:b w:val="0"/>
-          <w:sz w:val="18"/>
-        </w:rPr>
-        <w:t>Number: 43% EMA; 43% JITAI  |  Metric: compliance_pct  |  Topic: platform  |  Confidence: medium</w:t>
-      </w:r>
-    </w:p>
-    <w:p>
-      <w:r>
-        <w:rPr>
-          <w:b w:val="0"/>
-          <w:sz w:val="18"/>
-        </w:rPr>
-        <w:t>Source: oss_platform_analysis.html — Papel na arquitectura PerSense</w:t>
-      </w:r>
-    </w:p>
-    <w:p>
-      <w:r>
-        <w:rPr>
-          <w:b w:val="0"/>
-          <w:sz w:val="18"/>
-        </w:rPr>
-        <w:t>Original context: "Compliance de 43% EMA + 43% JITAI reportada."</w:t>
-      </w:r>
-    </w:p>
-    <w:p>
-      <w:r>
-        <w:rPr>
-          <w:b/>
-          <w:sz w:val="22"/>
-        </w:rPr>
-        <w:t>EV-042</w:t>
-      </w:r>
-    </w:p>
-    <w:p>
-      <w:r>
-        <w:rPr>
-          <w:b w:val="0"/>
-          <w:sz w:val="20"/>
-        </w:rPr>
-        <w:t>Claim: Falha de triagem documentada no PerSense/iNNOVSensing: 52,7%.</w:t>
-      </w:r>
-    </w:p>
-    <w:p>
-      <w:r>
-        <w:rPr>
-          <w:b w:val="0"/>
-          <w:sz w:val="18"/>
-        </w:rPr>
-        <w:t>Number: 52.7%  |  Metric: screen_fail_pct  |  Topic: pilot_metric  |  Confidence: high</w:t>
-      </w:r>
-    </w:p>
-    <w:p>
-      <w:r>
-        <w:rPr>
-          <w:b w:val="0"/>
-          <w:sz w:val="18"/>
-        </w:rPr>
-        <w:t>Source: relatorio_estrategico_master_persense.html — Modelos de Desenvolvimento — Inovação e Translação</w:t>
-      </w:r>
-    </w:p>
-    <w:p>
-      <w:r>
-        <w:rPr>
-          <w:b w:val="0"/>
-          <w:sz w:val="18"/>
-        </w:rPr>
-        <w:t>Original context: "taxa de consentimento de 34%, falha de triagem de 52.7%, e preferência por suporte presencial."</w:t>
-      </w:r>
-    </w:p>
-    <w:p>
-      <w:r>
-        <w:rPr>
-          <w:b/>
-          <w:sz w:val="22"/>
-        </w:rPr>
-        <w:t>EV-046</w:t>
-      </w:r>
-    </w:p>
-    <w:p>
-      <w:r>
-        <w:rPr>
-          <w:b w:val="0"/>
-          <w:sz w:val="20"/>
-        </w:rPr>
-        <w:t>Claim: Custo total do piloto PoV proposto: €5–10K (developer 30h €3–6K + infra mindLAMP €120 + 10 Fitbits €2–3K).</w:t>
-      </w:r>
-    </w:p>
-    <w:p>
-      <w:r>
-        <w:rPr>
-          <w:b w:val="0"/>
-          <w:sz w:val="18"/>
-        </w:rPr>
-        <w:t>Number: €5-10K  |  Metric: cost_eur  |  Topic: pilot_metric  |  Confidence: high</w:t>
-      </w:r>
-    </w:p>
-    <w:p>
-      <w:r>
-        <w:rPr>
-          <w:b w:val="0"/>
-          <w:sz w:val="18"/>
-        </w:rPr>
-        <w:t>Source: relatorio_saude_mental_digital_final (3).html — Cronograma do piloto PoV</w:t>
-      </w:r>
-    </w:p>
-    <w:p>
-      <w:r>
-        <w:rPr>
-          <w:b w:val="0"/>
-          <w:sz w:val="18"/>
-        </w:rPr>
-        <w:t>Original context: "Developer time (30h): €3–6K. Infraestrutura (mindLAMP Hetzner 3 meses): €120. Fitbits para sensing (10 unidades, reutilizáveis): €2–3K. Total: €5–10K."</w:t>
-      </w:r>
-    </w:p>
-    <w:p>
-      <w:r>
-        <w:rPr>
-          <w:b/>
-          <w:sz w:val="22"/>
-        </w:rPr>
-        <w:t>EV-048</w:t>
-      </w:r>
-    </w:p>
-    <w:p>
-      <w:r>
-        <w:rPr>
-          <w:b w:val="0"/>
-          <w:sz w:val="20"/>
-        </w:rPr>
-        <w:t>Claim: iNNOVSensing custou €120K para produzir dados equivalentes em valor estratégico ao piloto PoV proposto.</w:t>
-      </w:r>
-    </w:p>
-    <w:p>
-      <w:r>
-        <w:rPr>
-          <w:b w:val="0"/>
-          <w:sz w:val="18"/>
-        </w:rPr>
-        <w:t>Number: €120K  |  Metric: cost_eur  |  Topic: pilot_metric  |  Confidence: medium</w:t>
-      </w:r>
-    </w:p>
-    <w:p>
-      <w:r>
-        <w:rPr>
-          <w:b w:val="0"/>
-          <w:sz w:val="18"/>
-        </w:rPr>
-        <w:t>Source: relatorio_saude_mental_digital_final (3).html — Cronograma do piloto PoV</w:t>
-      </w:r>
-    </w:p>
-    <w:p>
-      <w:r>
-        <w:rPr>
-          <w:b w:val="0"/>
-          <w:sz w:val="18"/>
-        </w:rPr>
-        <w:t>Original context: "Por comparação, o iNNOVSensing custou €120K para produzir dados equivalentes em termos de valor estratégico para a startup."</w:t>
-      </w:r>
-    </w:p>
-    <w:p>
-      <w:r>
-        <w:rPr>
-          <w:b/>
-          <w:sz w:val="24"/>
-        </w:rPr>
-        <w:t>Coverage check</w:t>
-      </w:r>
-    </w:p>
-    <w:p>
-      <w:r>
-        <w:rPr>
-          <w:b w:val="0"/>
-          <w:sz w:val="20"/>
-        </w:rPr>
-        <w:t>EV-IDs cited in deck: 10 — EV-005, EV-012, EV-013, EV-021, EV-023, EV-031, EV-040, EV-042, EV-046, EV-048</w:t>
-      </w:r>
-    </w:p>
-    <w:p>
-      <w:r>
-        <w:rPr>
-          <w:b w:val="0"/>
-          <w:sz w:val="20"/>
-        </w:rPr>
-        <w:t>EV-IDs documented in this notes file: 10 — EV-005, EV-012, EV-013, EV-021, EV-023, EV-031, EV-040, EV-042, EV-046, EV-048</w:t>
+        <w:t>• relatorio_saude_mental_digital_v2.html</w:t>
       </w:r>
     </w:p>
     <w:sectPr>

</xml_diff>